<commit_message>
June 28 update: remove KCA/Dr Rotich refs, delete outdated docs, update dates across all generators
</commit_message>
<xml_diff>
--- a/docs/EXECUTIVE_SUMMARY_ONE_PAGER.docx
+++ b/docs/EXECUTIVE_SUMMARY_ONE_PAGER.docx
@@ -76,7 +76,7 @@
                 <w:sz w:val="17"/>
                 <w:szCs w:val="17"/>
               </w:rPr>
-              <w:t xml:space="preserve">Peter M. Kaulani  |  KCA University  |  June 27, 2026 (Updated)</w:t>
+              <w:t xml:space="preserve">Peter M. Kaulani  |  June 28, 2026</w:t>
             </w:r>
           </w:p>
         </w:tc>
@@ -959,7 +959,7 @@
                 <w:sz w:val="17"/>
                 <w:szCs w:val="17"/>
               </w:rPr>
-              <w:t xml:space="preserve"> — full algorithm disclosure by June 5, 2026</w:t>
+              <w:t xml:space="preserve"> — algorithm disclosure order (complied with as of June 28, 2026)</w:t>
             </w:r>
           </w:p>
           <w:p>
@@ -996,7 +996,7 @@
                 <w:sz w:val="17"/>
                 <w:szCs w:val="17"/>
               </w:rPr>
-              <w:t xml:space="preserve"> transferred to Constitutional &amp; Human Rights Div., Milimani (June 9, 2026)</w:t>
+              <w:t xml:space="preserve"> before Constitutional &amp; Human Rights Div., Milimani — ongoing</w:t>
             </w:r>
           </w:p>
           <w:p>

</xml_diff>